<commit_message>
refactor(gold): replace KPI aggregates with dimensional star schema model
</commit_message>
<xml_diff>
--- a/data.docx
+++ b/data.docx
@@ -7,9 +7,12 @@
         <w:ind w:left="1080" w:hanging="360"/>
       </w:pPr>
       <w:r>
+        <w:rPr>
+          <w:noProof/>
+        </w:rPr>
         <w:drawing>
-          <wp:inline distT="0" distB="0" distL="0" distR="0" wp14:anchorId="104F712F" wp14:editId="23D8ABB0">
-            <wp:extent cx="2362405" cy="5989839"/>
+          <wp:inline distT="0" distB="0" distL="0" distR="0" wp14:anchorId="104F712F" wp14:editId="4F092546">
+            <wp:extent cx="2362200" cy="4291780"/>
             <wp:effectExtent l="0" t="0" r="0" b="0"/>
             <wp:docPr id="1832433124" name="Imagen 1" descr="Interfaz de usuario gráfica, Texto&#10;&#10;El contenido generado por IA puede ser incorrecto."/>
             <wp:cNvGraphicFramePr>
@@ -31,7 +34,7 @@
                   <pic:spPr>
                     <a:xfrm>
                       <a:off x="0" y="0"/>
-                      <a:ext cx="2362405" cy="5989839"/>
+                      <a:ext cx="2364141" cy="4295307"/>
                     </a:xfrm>
                     <a:prstGeom prst="rect">
                       <a:avLst/>
@@ -65,15 +68,7 @@
         </w:numPr>
       </w:pPr>
       <w:r>
-        <w:t>src/</w:t>
-      </w:r>
-      <w:proofErr w:type="spellStart"/>
-      <w:r>
-        <w:t>ingestion</w:t>
-      </w:r>
-      <w:proofErr w:type="spellEnd"/>
-      <w:r>
-        <w:t xml:space="preserve"> → scripts de ingesta al </w:t>
+        <w:t xml:space="preserve">src/ingestion → scripts de ingesta al </w:t>
       </w:r>
       <w:r>
         <w:rPr>
@@ -92,15 +87,7 @@
         </w:numPr>
       </w:pPr>
       <w:r>
-        <w:t>src/</w:t>
-      </w:r>
-      <w:proofErr w:type="spellStart"/>
-      <w:r>
-        <w:t>processing</w:t>
-      </w:r>
-      <w:proofErr w:type="spellEnd"/>
-      <w:r>
-        <w:t xml:space="preserve"> → transformaciones</w:t>
+        <w:t>src/processing → transformaciones</w:t>
       </w:r>
     </w:p>
     <w:p>
@@ -112,15 +99,7 @@
         </w:numPr>
       </w:pPr>
       <w:r>
-        <w:t>src/</w:t>
-      </w:r>
-      <w:proofErr w:type="spellStart"/>
-      <w:r>
-        <w:t>utils</w:t>
-      </w:r>
-      <w:proofErr w:type="spellEnd"/>
-      <w:r>
-        <w:t xml:space="preserve"> → funciones reutilizables</w:t>
+        <w:t>src/utils → funciones reutilizables</w:t>
       </w:r>
     </w:p>
     <w:p>
@@ -144,17 +123,718 @@
         </w:numPr>
       </w:pPr>
       <w:r>
-        <w:t xml:space="preserve">logs → para </w:t>
-      </w:r>
-      <w:proofErr w:type="spellStart"/>
-      <w:r>
-        <w:t>logging</w:t>
-      </w:r>
-      <w:proofErr w:type="spellEnd"/>
-      <w:r>
-        <w:t xml:space="preserve"> del pipeline</w:t>
+        <w:t>logs → para logging del pipeline</w:t>
       </w:r>
     </w:p>
+    <w:p>
+      <w:pPr>
+        <w:rPr>
+          <w:lang w:val="en-US"/>
+        </w:rPr>
+      </w:pPr>
+    </w:p>
+    <w:tbl>
+      <w:tblPr>
+        <w:tblStyle w:val="Tablaconcuadrcula"/>
+        <w:tblW w:w="9634" w:type="dxa"/>
+        <w:tblLook w:val="04A0" w:firstRow="1" w:lastRow="0" w:firstColumn="1" w:lastColumn="0" w:noHBand="0" w:noVBand="1"/>
+      </w:tblPr>
+      <w:tblGrid>
+        <w:gridCol w:w="1841"/>
+        <w:gridCol w:w="999"/>
+        <w:gridCol w:w="6794"/>
+      </w:tblGrid>
+      <w:tr>
+        <w:tc>
+          <w:tcPr>
+            <w:tcW w:w="0" w:type="auto"/>
+            <w:hideMark/>
+          </w:tcPr>
+          <w:p>
+            <w:pPr>
+              <w:spacing w:after="160" w:line="259" w:lineRule="auto"/>
+              <w:jc w:val="center"/>
+              <w:rPr>
+                <w:rFonts w:ascii="Calibri" w:hAnsi="Calibri" w:cs="Calibri"/>
+                <w:b/>
+                <w:bCs/>
+                <w:sz w:val="18"/>
+                <w:szCs w:val="18"/>
+              </w:rPr>
+            </w:pPr>
+            <w:r>
+              <w:rPr>
+                <w:rFonts w:ascii="Calibri" w:hAnsi="Calibri" w:cs="Calibri"/>
+                <w:b/>
+                <w:bCs/>
+                <w:sz w:val="18"/>
+                <w:szCs w:val="18"/>
+              </w:rPr>
+              <w:t>Tabla</w:t>
+            </w:r>
+          </w:p>
+        </w:tc>
+        <w:tc>
+          <w:tcPr>
+            <w:tcW w:w="0" w:type="auto"/>
+            <w:hideMark/>
+          </w:tcPr>
+          <w:p>
+            <w:pPr>
+              <w:spacing w:after="160" w:line="259" w:lineRule="auto"/>
+              <w:jc w:val="center"/>
+              <w:rPr>
+                <w:rFonts w:ascii="Calibri" w:hAnsi="Calibri" w:cs="Calibri"/>
+                <w:b/>
+                <w:bCs/>
+                <w:sz w:val="18"/>
+                <w:szCs w:val="18"/>
+              </w:rPr>
+            </w:pPr>
+            <w:r>
+              <w:rPr>
+                <w:rFonts w:ascii="Calibri" w:hAnsi="Calibri" w:cs="Calibri"/>
+                <w:b/>
+                <w:bCs/>
+                <w:sz w:val="18"/>
+                <w:szCs w:val="18"/>
+              </w:rPr>
+              <w:t>Registros</w:t>
+            </w:r>
+          </w:p>
+        </w:tc>
+        <w:tc>
+          <w:tcPr>
+            <w:tcW w:w="6794" w:type="dxa"/>
+            <w:hideMark/>
+          </w:tcPr>
+          <w:p>
+            <w:pPr>
+              <w:spacing w:after="160" w:line="259" w:lineRule="auto"/>
+              <w:jc w:val="center"/>
+              <w:rPr>
+                <w:rFonts w:ascii="Calibri" w:hAnsi="Calibri" w:cs="Calibri"/>
+                <w:b/>
+                <w:bCs/>
+                <w:sz w:val="18"/>
+                <w:szCs w:val="18"/>
+              </w:rPr>
+            </w:pPr>
+            <w:r>
+              <w:rPr>
+                <w:rFonts w:ascii="Calibri" w:hAnsi="Calibri" w:cs="Calibri"/>
+                <w:b/>
+                <w:bCs/>
+                <w:sz w:val="18"/>
+                <w:szCs w:val="18"/>
+              </w:rPr>
+              <w:t>Campos</w:t>
+            </w:r>
+          </w:p>
+        </w:tc>
+      </w:tr>
+      <w:tr>
+        <w:tc>
+          <w:tcPr>
+            <w:tcW w:w="0" w:type="auto"/>
+            <w:hideMark/>
+          </w:tcPr>
+          <w:p>
+            <w:pPr>
+              <w:spacing w:after="160" w:line="259" w:lineRule="auto"/>
+              <w:rPr>
+                <w:rFonts w:ascii="Calibri" w:hAnsi="Calibri" w:cs="Calibri"/>
+                <w:sz w:val="18"/>
+                <w:szCs w:val="18"/>
+              </w:rPr>
+            </w:pPr>
+            <w:r>
+              <w:rPr>
+                <w:rFonts w:ascii="Calibri" w:hAnsi="Calibri" w:cs="Calibri"/>
+                <w:sz w:val="18"/>
+                <w:szCs w:val="18"/>
+              </w:rPr>
+              <w:t>clientes</w:t>
+            </w:r>
+          </w:p>
+        </w:tc>
+        <w:tc>
+          <w:tcPr>
+            <w:tcW w:w="0" w:type="auto"/>
+            <w:hideMark/>
+          </w:tcPr>
+          <w:p>
+            <w:pPr>
+              <w:spacing w:after="160" w:line="259" w:lineRule="auto"/>
+              <w:jc w:val="center"/>
+              <w:rPr>
+                <w:rFonts w:ascii="Calibri" w:hAnsi="Calibri" w:cs="Calibri"/>
+                <w:sz w:val="18"/>
+                <w:szCs w:val="18"/>
+              </w:rPr>
+            </w:pPr>
+            <w:r>
+              <w:rPr>
+                <w:rFonts w:ascii="Calibri" w:hAnsi="Calibri" w:cs="Calibri"/>
+                <w:sz w:val="18"/>
+                <w:szCs w:val="18"/>
+              </w:rPr>
+              <w:t>2000</w:t>
+            </w:r>
+          </w:p>
+        </w:tc>
+        <w:tc>
+          <w:tcPr>
+            <w:tcW w:w="6794" w:type="dxa"/>
+            <w:hideMark/>
+          </w:tcPr>
+          <w:p>
+            <w:pPr>
+              <w:spacing w:after="160" w:line="259" w:lineRule="auto"/>
+              <w:rPr>
+                <w:rFonts w:ascii="Calibri" w:hAnsi="Calibri" w:cs="Calibri"/>
+                <w:sz w:val="18"/>
+                <w:szCs w:val="18"/>
+              </w:rPr>
+            </w:pPr>
+            <w:r>
+              <w:rPr>
+                <w:rFonts w:ascii="Calibri" w:hAnsi="Calibri" w:cs="Calibri"/>
+                <w:sz w:val="18"/>
+                <w:szCs w:val="18"/>
+              </w:rPr>
+              <w:t>customer_id, dni, nombre, telefono, dirección, ciudad, segmento_cliente, tipo_cliente, score_riesgo, ingreso_estimado, fecha_registro</w:t>
+            </w:r>
+          </w:p>
+        </w:tc>
+      </w:tr>
+      <w:tr>
+        <w:tc>
+          <w:tcPr>
+            <w:tcW w:w="0" w:type="auto"/>
+            <w:hideMark/>
+          </w:tcPr>
+          <w:p>
+            <w:pPr>
+              <w:spacing w:after="160" w:line="259" w:lineRule="auto"/>
+              <w:rPr>
+                <w:rFonts w:ascii="Calibri" w:hAnsi="Calibri" w:cs="Calibri"/>
+                <w:sz w:val="18"/>
+                <w:szCs w:val="18"/>
+              </w:rPr>
+            </w:pPr>
+            <w:r>
+              <w:rPr>
+                <w:rFonts w:ascii="Calibri" w:hAnsi="Calibri" w:cs="Calibri"/>
+                <w:sz w:val="18"/>
+                <w:szCs w:val="18"/>
+              </w:rPr>
+              <w:t>productos</w:t>
+            </w:r>
+          </w:p>
+        </w:tc>
+        <w:tc>
+          <w:tcPr>
+            <w:tcW w:w="0" w:type="auto"/>
+            <w:hideMark/>
+          </w:tcPr>
+          <w:p>
+            <w:pPr>
+              <w:spacing w:after="160" w:line="259" w:lineRule="auto"/>
+              <w:jc w:val="center"/>
+              <w:rPr>
+                <w:rFonts w:ascii="Calibri" w:hAnsi="Calibri" w:cs="Calibri"/>
+                <w:sz w:val="18"/>
+                <w:szCs w:val="18"/>
+              </w:rPr>
+            </w:pPr>
+            <w:r>
+              <w:rPr>
+                <w:rFonts w:ascii="Calibri" w:hAnsi="Calibri" w:cs="Calibri"/>
+                <w:sz w:val="18"/>
+                <w:szCs w:val="18"/>
+              </w:rPr>
+              <w:t>20</w:t>
+            </w:r>
+          </w:p>
+        </w:tc>
+        <w:tc>
+          <w:tcPr>
+            <w:tcW w:w="6794" w:type="dxa"/>
+            <w:hideMark/>
+          </w:tcPr>
+          <w:p>
+            <w:pPr>
+              <w:spacing w:after="160" w:line="259" w:lineRule="auto"/>
+              <w:rPr>
+                <w:rFonts w:ascii="Calibri" w:hAnsi="Calibri" w:cs="Calibri"/>
+                <w:sz w:val="18"/>
+                <w:szCs w:val="18"/>
+              </w:rPr>
+            </w:pPr>
+            <w:r>
+              <w:rPr>
+                <w:rFonts w:ascii="Calibri" w:hAnsi="Calibri" w:cs="Calibri"/>
+                <w:sz w:val="18"/>
+                <w:szCs w:val="18"/>
+              </w:rPr>
+              <w:t>product_id, nombre producto, tipo_producto, tasa_interes, plazo_meses</w:t>
+            </w:r>
+          </w:p>
+        </w:tc>
+      </w:tr>
+      <w:tr>
+        <w:tc>
+          <w:tcPr>
+            <w:tcW w:w="0" w:type="auto"/>
+            <w:hideMark/>
+          </w:tcPr>
+          <w:p>
+            <w:pPr>
+              <w:spacing w:after="160" w:line="259" w:lineRule="auto"/>
+              <w:rPr>
+                <w:rFonts w:ascii="Calibri" w:hAnsi="Calibri" w:cs="Calibri"/>
+                <w:sz w:val="18"/>
+                <w:szCs w:val="18"/>
+              </w:rPr>
+            </w:pPr>
+            <w:r>
+              <w:rPr>
+                <w:rFonts w:ascii="Calibri" w:hAnsi="Calibri" w:cs="Calibri"/>
+                <w:sz w:val="18"/>
+                <w:szCs w:val="18"/>
+              </w:rPr>
+              <w:t>deuda</w:t>
+            </w:r>
+          </w:p>
+        </w:tc>
+        <w:tc>
+          <w:tcPr>
+            <w:tcW w:w="0" w:type="auto"/>
+            <w:hideMark/>
+          </w:tcPr>
+          <w:p>
+            <w:pPr>
+              <w:spacing w:after="160" w:line="259" w:lineRule="auto"/>
+              <w:jc w:val="center"/>
+              <w:rPr>
+                <w:rFonts w:ascii="Calibri" w:hAnsi="Calibri" w:cs="Calibri"/>
+                <w:sz w:val="18"/>
+                <w:szCs w:val="18"/>
+              </w:rPr>
+            </w:pPr>
+            <w:r>
+              <w:rPr>
+                <w:rFonts w:ascii="Calibri" w:hAnsi="Calibri" w:cs="Calibri"/>
+                <w:sz w:val="18"/>
+                <w:szCs w:val="18"/>
+              </w:rPr>
+              <w:t>4500</w:t>
+            </w:r>
+          </w:p>
+        </w:tc>
+        <w:tc>
+          <w:tcPr>
+            <w:tcW w:w="6794" w:type="dxa"/>
+            <w:hideMark/>
+          </w:tcPr>
+          <w:p>
+            <w:pPr>
+              <w:spacing w:after="160" w:line="259" w:lineRule="auto"/>
+              <w:rPr>
+                <w:rFonts w:ascii="Calibri" w:hAnsi="Calibri" w:cs="Calibri"/>
+                <w:sz w:val="18"/>
+                <w:szCs w:val="18"/>
+              </w:rPr>
+            </w:pPr>
+            <w:r>
+              <w:rPr>
+                <w:rFonts w:ascii="Calibri" w:hAnsi="Calibri" w:cs="Calibri"/>
+                <w:sz w:val="18"/>
+                <w:szCs w:val="18"/>
+              </w:rPr>
+              <w:t>debt_id, customer_id, product_id, monto_original, saldo_actual, dias_mora, bucket_mora, fecha_vencimiento, estado_deuda</w:t>
+            </w:r>
+          </w:p>
+        </w:tc>
+      </w:tr>
+      <w:tr>
+        <w:tc>
+          <w:tcPr>
+            <w:tcW w:w="0" w:type="auto"/>
+            <w:hideMark/>
+          </w:tcPr>
+          <w:p>
+            <w:pPr>
+              <w:spacing w:after="160" w:line="259" w:lineRule="auto"/>
+              <w:rPr>
+                <w:rFonts w:ascii="Calibri" w:hAnsi="Calibri" w:cs="Calibri"/>
+                <w:sz w:val="18"/>
+                <w:szCs w:val="18"/>
+              </w:rPr>
+            </w:pPr>
+            <w:r>
+              <w:rPr>
+                <w:rFonts w:ascii="Calibri" w:hAnsi="Calibri" w:cs="Calibri"/>
+                <w:sz w:val="18"/>
+                <w:szCs w:val="18"/>
+              </w:rPr>
+              <w:t>pagos</w:t>
+            </w:r>
+          </w:p>
+        </w:tc>
+        <w:tc>
+          <w:tcPr>
+            <w:tcW w:w="0" w:type="auto"/>
+            <w:hideMark/>
+          </w:tcPr>
+          <w:p>
+            <w:pPr>
+              <w:spacing w:after="160" w:line="259" w:lineRule="auto"/>
+              <w:jc w:val="center"/>
+              <w:rPr>
+                <w:rFonts w:ascii="Calibri" w:hAnsi="Calibri" w:cs="Calibri"/>
+                <w:sz w:val="18"/>
+                <w:szCs w:val="18"/>
+              </w:rPr>
+            </w:pPr>
+            <w:r>
+              <w:rPr>
+                <w:rFonts w:ascii="Calibri" w:hAnsi="Calibri" w:cs="Calibri"/>
+                <w:sz w:val="18"/>
+                <w:szCs w:val="18"/>
+              </w:rPr>
+              <w:t>20000</w:t>
+            </w:r>
+          </w:p>
+        </w:tc>
+        <w:tc>
+          <w:tcPr>
+            <w:tcW w:w="6794" w:type="dxa"/>
+            <w:hideMark/>
+          </w:tcPr>
+          <w:p>
+            <w:pPr>
+              <w:spacing w:after="160" w:line="259" w:lineRule="auto"/>
+              <w:rPr>
+                <w:rFonts w:ascii="Calibri" w:hAnsi="Calibri" w:cs="Calibri"/>
+                <w:sz w:val="18"/>
+                <w:szCs w:val="18"/>
+              </w:rPr>
+            </w:pPr>
+            <w:r>
+              <w:rPr>
+                <w:rFonts w:ascii="Calibri" w:hAnsi="Calibri" w:cs="Calibri"/>
+                <w:sz w:val="18"/>
+                <w:szCs w:val="18"/>
+              </w:rPr>
+              <w:t>payment_id, debt_id, customer_id, monto pagó, metodo_pago, canal_pago, pago_parcial, fecha_pago</w:t>
+            </w:r>
+          </w:p>
+        </w:tc>
+      </w:tr>
+      <w:tr>
+        <w:tc>
+          <w:tcPr>
+            <w:tcW w:w="0" w:type="auto"/>
+            <w:hideMark/>
+          </w:tcPr>
+          <w:p>
+            <w:pPr>
+              <w:spacing w:after="160" w:line="259" w:lineRule="auto"/>
+              <w:rPr>
+                <w:rFonts w:ascii="Calibri" w:hAnsi="Calibri" w:cs="Calibri"/>
+                <w:sz w:val="18"/>
+                <w:szCs w:val="18"/>
+              </w:rPr>
+            </w:pPr>
+            <w:r>
+              <w:rPr>
+                <w:rFonts w:ascii="Calibri" w:hAnsi="Calibri" w:cs="Calibri"/>
+                <w:sz w:val="18"/>
+                <w:szCs w:val="18"/>
+              </w:rPr>
+              <w:t>gestiones_cobranza</w:t>
+            </w:r>
+          </w:p>
+        </w:tc>
+        <w:tc>
+          <w:tcPr>
+            <w:tcW w:w="0" w:type="auto"/>
+            <w:hideMark/>
+          </w:tcPr>
+          <w:p>
+            <w:pPr>
+              <w:spacing w:after="160" w:line="259" w:lineRule="auto"/>
+              <w:jc w:val="center"/>
+              <w:rPr>
+                <w:rFonts w:ascii="Calibri" w:hAnsi="Calibri" w:cs="Calibri"/>
+                <w:sz w:val="18"/>
+                <w:szCs w:val="18"/>
+              </w:rPr>
+            </w:pPr>
+            <w:r>
+              <w:rPr>
+                <w:rFonts w:ascii="Calibri" w:hAnsi="Calibri" w:cs="Calibri"/>
+                <w:sz w:val="18"/>
+                <w:szCs w:val="18"/>
+              </w:rPr>
+              <w:t>15000</w:t>
+            </w:r>
+          </w:p>
+        </w:tc>
+        <w:tc>
+          <w:tcPr>
+            <w:tcW w:w="6794" w:type="dxa"/>
+            <w:hideMark/>
+          </w:tcPr>
+          <w:p>
+            <w:pPr>
+              <w:spacing w:after="160" w:line="259" w:lineRule="auto"/>
+              <w:rPr>
+                <w:rFonts w:ascii="Calibri" w:hAnsi="Calibri" w:cs="Calibri"/>
+                <w:sz w:val="18"/>
+                <w:szCs w:val="18"/>
+              </w:rPr>
+            </w:pPr>
+            <w:r>
+              <w:rPr>
+                <w:rFonts w:ascii="Calibri" w:hAnsi="Calibri" w:cs="Calibri"/>
+                <w:sz w:val="18"/>
+                <w:szCs w:val="18"/>
+              </w:rPr>
+              <w:t>gestion_id, customer_id, debt_id, gestor_id, canal, resultado, exito_gestion, motivo_fallo, tiempo_respuesta_min, fecha_gestion</w:t>
+            </w:r>
+          </w:p>
+        </w:tc>
+      </w:tr>
+      <w:tr>
+        <w:tc>
+          <w:tcPr>
+            <w:tcW w:w="0" w:type="auto"/>
+            <w:hideMark/>
+          </w:tcPr>
+          <w:p>
+            <w:pPr>
+              <w:spacing w:after="160" w:line="259" w:lineRule="auto"/>
+              <w:rPr>
+                <w:rFonts w:ascii="Calibri" w:hAnsi="Calibri" w:cs="Calibri"/>
+                <w:sz w:val="18"/>
+                <w:szCs w:val="18"/>
+              </w:rPr>
+            </w:pPr>
+            <w:r>
+              <w:rPr>
+                <w:rFonts w:ascii="Calibri" w:hAnsi="Calibri" w:cs="Calibri"/>
+                <w:sz w:val="18"/>
+                <w:szCs w:val="18"/>
+              </w:rPr>
+              <w:t>promesas_pago</w:t>
+            </w:r>
+          </w:p>
+        </w:tc>
+        <w:tc>
+          <w:tcPr>
+            <w:tcW w:w="0" w:type="auto"/>
+            <w:hideMark/>
+          </w:tcPr>
+          <w:p>
+            <w:pPr>
+              <w:spacing w:after="160" w:line="259" w:lineRule="auto"/>
+              <w:jc w:val="center"/>
+              <w:rPr>
+                <w:rFonts w:ascii="Calibri" w:hAnsi="Calibri" w:cs="Calibri"/>
+                <w:sz w:val="18"/>
+                <w:szCs w:val="18"/>
+              </w:rPr>
+            </w:pPr>
+            <w:r>
+              <w:rPr>
+                <w:rFonts w:ascii="Calibri" w:hAnsi="Calibri" w:cs="Calibri"/>
+                <w:sz w:val="18"/>
+                <w:szCs w:val="18"/>
+              </w:rPr>
+              <w:t>4000</w:t>
+            </w:r>
+          </w:p>
+        </w:tc>
+        <w:tc>
+          <w:tcPr>
+            <w:tcW w:w="6794" w:type="dxa"/>
+            <w:hideMark/>
+          </w:tcPr>
+          <w:p>
+            <w:pPr>
+              <w:spacing w:after="160" w:line="259" w:lineRule="auto"/>
+              <w:rPr>
+                <w:rFonts w:ascii="Calibri" w:hAnsi="Calibri" w:cs="Calibri"/>
+                <w:sz w:val="18"/>
+                <w:szCs w:val="18"/>
+              </w:rPr>
+            </w:pPr>
+            <w:r>
+              <w:rPr>
+                <w:rFonts w:ascii="Calibri" w:hAnsi="Calibri" w:cs="Calibri"/>
+                <w:sz w:val="18"/>
+                <w:szCs w:val="18"/>
+              </w:rPr>
+              <w:t>promesa_id, customer_id, debt_id, monto_prometido, fecha_promesa, cumplida</w:t>
+            </w:r>
+          </w:p>
+        </w:tc>
+      </w:tr>
+      <w:tr>
+        <w:tc>
+          <w:tcPr>
+            <w:tcW w:w="0" w:type="auto"/>
+            <w:hideMark/>
+          </w:tcPr>
+          <w:p>
+            <w:pPr>
+              <w:spacing w:after="160" w:line="259" w:lineRule="auto"/>
+              <w:rPr>
+                <w:rFonts w:ascii="Calibri" w:hAnsi="Calibri" w:cs="Calibri"/>
+                <w:sz w:val="18"/>
+                <w:szCs w:val="18"/>
+              </w:rPr>
+            </w:pPr>
+            <w:r>
+              <w:rPr>
+                <w:rFonts w:ascii="Calibri" w:hAnsi="Calibri" w:cs="Calibri"/>
+                <w:sz w:val="18"/>
+                <w:szCs w:val="18"/>
+              </w:rPr>
+              <w:t>gestores</w:t>
+            </w:r>
+          </w:p>
+        </w:tc>
+        <w:tc>
+          <w:tcPr>
+            <w:tcW w:w="0" w:type="auto"/>
+            <w:hideMark/>
+          </w:tcPr>
+          <w:p>
+            <w:pPr>
+              <w:spacing w:after="160" w:line="259" w:lineRule="auto"/>
+              <w:jc w:val="center"/>
+              <w:rPr>
+                <w:rFonts w:ascii="Calibri" w:hAnsi="Calibri" w:cs="Calibri"/>
+                <w:sz w:val="18"/>
+                <w:szCs w:val="18"/>
+              </w:rPr>
+            </w:pPr>
+            <w:r>
+              <w:rPr>
+                <w:rFonts w:ascii="Calibri" w:hAnsi="Calibri" w:cs="Calibri"/>
+                <w:sz w:val="18"/>
+                <w:szCs w:val="18"/>
+              </w:rPr>
+              <w:t>30</w:t>
+            </w:r>
+          </w:p>
+        </w:tc>
+        <w:tc>
+          <w:tcPr>
+            <w:tcW w:w="6794" w:type="dxa"/>
+            <w:hideMark/>
+          </w:tcPr>
+          <w:p>
+            <w:pPr>
+              <w:spacing w:after="160" w:line="259" w:lineRule="auto"/>
+              <w:rPr>
+                <w:rFonts w:ascii="Calibri" w:hAnsi="Calibri" w:cs="Calibri"/>
+                <w:sz w:val="18"/>
+                <w:szCs w:val="18"/>
+              </w:rPr>
+            </w:pPr>
+            <w:r>
+              <w:rPr>
+                <w:rFonts w:ascii="Calibri" w:hAnsi="Calibri" w:cs="Calibri"/>
+                <w:sz w:val="18"/>
+                <w:szCs w:val="18"/>
+              </w:rPr>
+              <w:t>gestor_id, nombre, equipo, antiguedad_meses</w:t>
+            </w:r>
+          </w:p>
+        </w:tc>
+      </w:tr>
+      <w:tr>
+        <w:tc>
+          <w:tcPr>
+            <w:tcW w:w="0" w:type="auto"/>
+            <w:hideMark/>
+          </w:tcPr>
+          <w:p>
+            <w:pPr>
+              <w:spacing w:after="160" w:line="259" w:lineRule="auto"/>
+              <w:rPr>
+                <w:rFonts w:ascii="Calibri" w:hAnsi="Calibri" w:cs="Calibri"/>
+                <w:sz w:val="18"/>
+                <w:szCs w:val="18"/>
+              </w:rPr>
+            </w:pPr>
+            <w:r>
+              <w:rPr>
+                <w:rFonts w:ascii="Calibri" w:hAnsi="Calibri" w:cs="Calibri"/>
+                <w:sz w:val="18"/>
+                <w:szCs w:val="18"/>
+              </w:rPr>
+              <w:t>dim_calendario</w:t>
+            </w:r>
+          </w:p>
+        </w:tc>
+        <w:tc>
+          <w:tcPr>
+            <w:tcW w:w="0" w:type="auto"/>
+            <w:hideMark/>
+          </w:tcPr>
+          <w:p>
+            <w:pPr>
+              <w:spacing w:after="160" w:line="259" w:lineRule="auto"/>
+              <w:jc w:val="center"/>
+              <w:rPr>
+                <w:rFonts w:ascii="Calibri" w:hAnsi="Calibri" w:cs="Calibri"/>
+                <w:sz w:val="18"/>
+                <w:szCs w:val="18"/>
+              </w:rPr>
+            </w:pPr>
+            <w:r>
+              <w:rPr>
+                <w:rFonts w:ascii="Calibri" w:hAnsi="Calibri" w:cs="Calibri"/>
+                <w:sz w:val="18"/>
+                <w:szCs w:val="18"/>
+              </w:rPr>
+              <w:t>1500</w:t>
+            </w:r>
+          </w:p>
+        </w:tc>
+        <w:tc>
+          <w:tcPr>
+            <w:tcW w:w="6794" w:type="dxa"/>
+            <w:hideMark/>
+          </w:tcPr>
+          <w:p>
+            <w:pPr>
+              <w:spacing w:after="160" w:line="259" w:lineRule="auto"/>
+              <w:rPr>
+                <w:rFonts w:ascii="Calibri" w:hAnsi="Calibri" w:cs="Calibri"/>
+                <w:sz w:val="18"/>
+                <w:szCs w:val="18"/>
+              </w:rPr>
+            </w:pPr>
+            <w:r>
+              <w:rPr>
+                <w:rFonts w:ascii="Calibri" w:hAnsi="Calibri" w:cs="Calibri"/>
+                <w:sz w:val="18"/>
+                <w:szCs w:val="18"/>
+              </w:rPr>
+              <w:t>fecha, anio, mes, trimestre, semana, dia_semana</w:t>
+            </w:r>
+          </w:p>
+        </w:tc>
+      </w:tr>
+    </w:tbl>
+    <w:p/>
     <w:p>
       <w:pPr>
         <w:rPr>
@@ -170,7 +850,9 @@
     </w:p>
     <w:p>
       <w:r>
-        <w:lastRenderedPageBreak/>
+        <w:rPr>
+          <w:noProof/>
+        </w:rPr>
         <w:drawing>
           <wp:inline distT="0" distB="0" distL="0" distR="0" wp14:anchorId="27EE14F5" wp14:editId="1CBDAD08">
             <wp:extent cx="5400040" cy="4290060"/>
@@ -223,6 +905,9 @@
     </w:p>
     <w:p>
       <w:r>
+        <w:rPr>
+          <w:noProof/>
+        </w:rPr>
         <w:drawing>
           <wp:inline distT="0" distB="0" distL="0" distR="0" wp14:anchorId="7F892ECD" wp14:editId="032EC9AF">
             <wp:extent cx="5400040" cy="2901950"/>
@@ -262,21 +947,356 @@
     </w:p>
     <w:p>
       <w:r>
-        <w:t xml:space="preserve">CON </w:t>
-      </w:r>
-      <w:r>
-        <w:t xml:space="preserve">python -m </w:t>
-      </w:r>
-      <w:proofErr w:type="spellStart"/>
-      <w:r>
-        <w:t>src.ingestion.upload_bronze</w:t>
-      </w:r>
-      <w:proofErr w:type="spellEnd"/>
-      <w:r>
-        <w:t xml:space="preserve"> VA E</w:t>
+        <w:lastRenderedPageBreak/>
+        <w:t>CON python -m src.ingestion.upload_bronze VA E</w:t>
       </w:r>
       <w:r>
         <w:t>JECUTAR EL PIPELINE LOCAL Y LO VA CONECTAR A LA BUCKET DE LA CARPETA BRONZE EN FORMATO PARQUET YA QUE EN LOCAL SE TRAAJDO CON CARPETA RAW los csv</w:t>
+      </w:r>
+    </w:p>
+    <w:p>
+      <w:r>
+        <w:t>CLOUD STORAGE</w:t>
+      </w:r>
+    </w:p>
+    <w:p>
+      <w:r>
+        <w:rPr>
+          <w:noProof/>
+        </w:rPr>
+        <w:drawing>
+          <wp:inline distT="0" distB="0" distL="0" distR="0" wp14:anchorId="18987676" wp14:editId="18EF25D4">
+            <wp:extent cx="3787140" cy="1993900"/>
+            <wp:effectExtent l="0" t="0" r="3810" b="6350"/>
+            <wp:docPr id="2102331032" name="Imagen 1"/>
+            <wp:cNvGraphicFramePr>
+              <a:graphicFrameLocks xmlns:a="http://schemas.openxmlformats.org/drawingml/2006/main" noChangeAspect="1"/>
+            </wp:cNvGraphicFramePr>
+            <a:graphic xmlns:a="http://schemas.openxmlformats.org/drawingml/2006/main">
+              <a:graphicData uri="http://schemas.openxmlformats.org/drawingml/2006/picture">
+                <pic:pic xmlns:pic="http://schemas.openxmlformats.org/drawingml/2006/picture">
+                  <pic:nvPicPr>
+                    <pic:cNvPr id="2102331032" name=""/>
+                    <pic:cNvPicPr/>
+                  </pic:nvPicPr>
+                  <pic:blipFill>
+                    <a:blip r:embed="rId8"/>
+                    <a:stretch>
+                      <a:fillRect/>
+                    </a:stretch>
+                  </pic:blipFill>
+                  <pic:spPr>
+                    <a:xfrm>
+                      <a:off x="0" y="0"/>
+                      <a:ext cx="3791293" cy="1996087"/>
+                    </a:xfrm>
+                    <a:prstGeom prst="rect">
+                      <a:avLst/>
+                    </a:prstGeom>
+                  </pic:spPr>
+                </pic:pic>
+              </a:graphicData>
+            </a:graphic>
+          </wp:inline>
+        </w:drawing>
+      </w:r>
+    </w:p>
+    <w:p>
+      <w:r>
+        <w:t xml:space="preserve">AHORA TOCAR HACER BRONZE </w:t>
+      </w:r>
+      <w:r>
+        <w:sym w:font="Wingdings" w:char="F0E0"/>
+      </w:r>
+      <w:r>
+        <w:t xml:space="preserve"> SILVER</w:t>
+      </w:r>
+    </w:p>
+    <w:p>
+      <w:r>
+        <w:rPr>
+          <w:noProof/>
+        </w:rPr>
+        <w:drawing>
+          <wp:inline distT="0" distB="0" distL="0" distR="0" wp14:anchorId="0F320109" wp14:editId="4C984009">
+            <wp:extent cx="5400040" cy="1422400"/>
+            <wp:effectExtent l="0" t="0" r="0" b="6350"/>
+            <wp:docPr id="720354176" name="Imagen 1" descr="Interfaz de usuario gráfica, Texto&#10;&#10;El contenido generado por IA puede ser incorrecto."/>
+            <wp:cNvGraphicFramePr>
+              <a:graphicFrameLocks xmlns:a="http://schemas.openxmlformats.org/drawingml/2006/main" noChangeAspect="1"/>
+            </wp:cNvGraphicFramePr>
+            <a:graphic xmlns:a="http://schemas.openxmlformats.org/drawingml/2006/main">
+              <a:graphicData uri="http://schemas.openxmlformats.org/drawingml/2006/picture">
+                <pic:pic xmlns:pic="http://schemas.openxmlformats.org/drawingml/2006/picture">
+                  <pic:nvPicPr>
+                    <pic:cNvPr id="720354176" name="Imagen 1" descr="Interfaz de usuario gráfica, Texto&#10;&#10;El contenido generado por IA puede ser incorrecto."/>
+                    <pic:cNvPicPr/>
+                  </pic:nvPicPr>
+                  <pic:blipFill>
+                    <a:blip r:embed="rId9"/>
+                    <a:stretch>
+                      <a:fillRect/>
+                    </a:stretch>
+                  </pic:blipFill>
+                  <pic:spPr>
+                    <a:xfrm>
+                      <a:off x="0" y="0"/>
+                      <a:ext cx="5404535" cy="1423584"/>
+                    </a:xfrm>
+                    <a:prstGeom prst="rect">
+                      <a:avLst/>
+                    </a:prstGeom>
+                  </pic:spPr>
+                </pic:pic>
+              </a:graphicData>
+            </a:graphic>
+          </wp:inline>
+        </w:drawing>
+      </w:r>
+      <w:r>
+        <w:rPr>
+          <w:noProof/>
+        </w:rPr>
+        <w:drawing>
+          <wp:inline distT="0" distB="0" distL="0" distR="0" wp14:anchorId="65E5F5C0" wp14:editId="62B16DC2">
+            <wp:extent cx="5400040" cy="1514475"/>
+            <wp:effectExtent l="0" t="0" r="0" b="9525"/>
+            <wp:docPr id="969910657" name="Imagen 1"/>
+            <wp:cNvGraphicFramePr>
+              <a:graphicFrameLocks xmlns:a="http://schemas.openxmlformats.org/drawingml/2006/main" noChangeAspect="1"/>
+            </wp:cNvGraphicFramePr>
+            <a:graphic xmlns:a="http://schemas.openxmlformats.org/drawingml/2006/main">
+              <a:graphicData uri="http://schemas.openxmlformats.org/drawingml/2006/picture">
+                <pic:pic xmlns:pic="http://schemas.openxmlformats.org/drawingml/2006/picture">
+                  <pic:nvPicPr>
+                    <pic:cNvPr id="969910657" name=""/>
+                    <pic:cNvPicPr/>
+                  </pic:nvPicPr>
+                  <pic:blipFill>
+                    <a:blip r:embed="rId10"/>
+                    <a:stretch>
+                      <a:fillRect/>
+                    </a:stretch>
+                  </pic:blipFill>
+                  <pic:spPr>
+                    <a:xfrm>
+                      <a:off x="0" y="0"/>
+                      <a:ext cx="5400040" cy="1514475"/>
+                    </a:xfrm>
+                    <a:prstGeom prst="rect">
+                      <a:avLst/>
+                    </a:prstGeom>
+                  </pic:spPr>
+                </pic:pic>
+              </a:graphicData>
+            </a:graphic>
+          </wp:inline>
+        </w:drawing>
+      </w:r>
+    </w:p>
+    <w:p>
+      <w:r>
+        <w:t xml:space="preserve">Donde ya el pipeline </w:t>
+      </w:r>
+    </w:p>
+    <w:p>
+      <w:r>
+        <w:rPr>
+          <w:rFonts w:ascii="Segoe UI Symbol" w:hAnsi="Segoe UI Symbol" w:cs="Segoe UI Symbol"/>
+        </w:rPr>
+        <w:t>✔</w:t>
+      </w:r>
+      <w:r>
+        <w:t xml:space="preserve"> leer bronze</w:t>
+      </w:r>
+      <w:r>
+        <w:br/>
+      </w:r>
+      <w:r>
+        <w:rPr>
+          <w:rFonts w:ascii="Segoe UI Symbol" w:hAnsi="Segoe UI Symbol" w:cs="Segoe UI Symbol"/>
+        </w:rPr>
+        <w:t>✔</w:t>
+      </w:r>
+      <w:r>
+        <w:t xml:space="preserve"> limpiar columnas</w:t>
+      </w:r>
+      <w:r>
+        <w:br/>
+      </w:r>
+      <w:r>
+        <w:rPr>
+          <w:rFonts w:ascii="Segoe UI Symbol" w:hAnsi="Segoe UI Symbol" w:cs="Segoe UI Symbol"/>
+        </w:rPr>
+        <w:t>✔</w:t>
+      </w:r>
+      <w:r>
+        <w:t xml:space="preserve"> transformar tipos</w:t>
+      </w:r>
+      <w:r>
+        <w:br/>
+      </w:r>
+      <w:r>
+        <w:rPr>
+          <w:rFonts w:ascii="Segoe UI Symbol" w:hAnsi="Segoe UI Symbol" w:cs="Segoe UI Symbol"/>
+        </w:rPr>
+        <w:t>✔</w:t>
+      </w:r>
+      <w:r>
+        <w:t xml:space="preserve"> eliminar duplicados</w:t>
+      </w:r>
+      <w:r>
+        <w:br/>
+      </w:r>
+      <w:r>
+        <w:rPr>
+          <w:rFonts w:ascii="Segoe UI Symbol" w:hAnsi="Segoe UI Symbol" w:cs="Segoe UI Symbol"/>
+        </w:rPr>
+        <w:t>✔</w:t>
+      </w:r>
+      <w:r>
+        <w:t xml:space="preserve"> guardar en silver</w:t>
+      </w:r>
+    </w:p>
+    <w:p>
+      <w:r>
+        <w:t>CAPA GOL</w:t>
+      </w:r>
+    </w:p>
+    <w:p>
+      <w:r>
+        <w:rPr>
+          <w:noProof/>
+        </w:rPr>
+        <w:lastRenderedPageBreak/>
+        <w:drawing>
+          <wp:inline distT="0" distB="0" distL="0" distR="0" wp14:anchorId="0BB2C1CF" wp14:editId="24C6E5DF">
+            <wp:extent cx="5400040" cy="2541270"/>
+            <wp:effectExtent l="0" t="0" r="0" b="0"/>
+            <wp:docPr id="825691728" name="Imagen 1" descr="Texto&#10;&#10;El contenido generado por IA puede ser incorrecto."/>
+            <wp:cNvGraphicFramePr>
+              <a:graphicFrameLocks xmlns:a="http://schemas.openxmlformats.org/drawingml/2006/main" noChangeAspect="1"/>
+            </wp:cNvGraphicFramePr>
+            <a:graphic xmlns:a="http://schemas.openxmlformats.org/drawingml/2006/main">
+              <a:graphicData uri="http://schemas.openxmlformats.org/drawingml/2006/picture">
+                <pic:pic xmlns:pic="http://schemas.openxmlformats.org/drawingml/2006/picture">
+                  <pic:nvPicPr>
+                    <pic:cNvPr id="825691728" name="Imagen 1" descr="Texto&#10;&#10;El contenido generado por IA puede ser incorrecto."/>
+                    <pic:cNvPicPr/>
+                  </pic:nvPicPr>
+                  <pic:blipFill>
+                    <a:blip r:embed="rId11"/>
+                    <a:stretch>
+                      <a:fillRect/>
+                    </a:stretch>
+                  </pic:blipFill>
+                  <pic:spPr>
+                    <a:xfrm>
+                      <a:off x="0" y="0"/>
+                      <a:ext cx="5400040" cy="2541270"/>
+                    </a:xfrm>
+                    <a:prstGeom prst="rect">
+                      <a:avLst/>
+                    </a:prstGeom>
+                  </pic:spPr>
+                </pic:pic>
+              </a:graphicData>
+            </a:graphic>
+          </wp:inline>
+        </w:drawing>
+      </w:r>
+    </w:p>
+    <w:p>
+      <w:r>
+        <w:t>PROCESAMIENTO SPARK SERVELES</w:t>
+      </w:r>
+    </w:p>
+    <w:p>
+      <w:r>
+        <w:t>En local vamos a crear carpeta code donde vamos a tener 2 script</w:t>
+      </w:r>
+    </w:p>
+    <w:p>
+      <w:r>
+        <w:drawing>
+          <wp:inline distT="0" distB="0" distL="0" distR="0" wp14:anchorId="14135311" wp14:editId="39C5E1D1">
+            <wp:extent cx="4547900" cy="1960033"/>
+            <wp:effectExtent l="0" t="0" r="5080" b="2540"/>
+            <wp:docPr id="144892331" name="Imagen 1"/>
+            <wp:cNvGraphicFramePr>
+              <a:graphicFrameLocks xmlns:a="http://schemas.openxmlformats.org/drawingml/2006/main" noChangeAspect="1"/>
+            </wp:cNvGraphicFramePr>
+            <a:graphic xmlns:a="http://schemas.openxmlformats.org/drawingml/2006/main">
+              <a:graphicData uri="http://schemas.openxmlformats.org/drawingml/2006/picture">
+                <pic:pic xmlns:pic="http://schemas.openxmlformats.org/drawingml/2006/picture">
+                  <pic:nvPicPr>
+                    <pic:cNvPr id="144892331" name=""/>
+                    <pic:cNvPicPr/>
+                  </pic:nvPicPr>
+                  <pic:blipFill>
+                    <a:blip r:embed="rId12"/>
+                    <a:stretch>
+                      <a:fillRect/>
+                    </a:stretch>
+                  </pic:blipFill>
+                  <pic:spPr>
+                    <a:xfrm>
+                      <a:off x="0" y="0"/>
+                      <a:ext cx="4570795" cy="1969900"/>
+                    </a:xfrm>
+                    <a:prstGeom prst="rect">
+                      <a:avLst/>
+                    </a:prstGeom>
+                  </pic:spPr>
+                </pic:pic>
+              </a:graphicData>
+            </a:graphic>
+          </wp:inline>
+        </w:drawing>
+      </w:r>
+    </w:p>
+    <w:p>
+      <w:r>
+        <w:t>Ahora en el local vamos a instalar pyspark</w:t>
+      </w:r>
+    </w:p>
+    <w:p>
+      <w:r>
+        <w:drawing>
+          <wp:inline distT="0" distB="0" distL="0" distR="0" wp14:anchorId="7EACFF54" wp14:editId="078CF06F">
+            <wp:extent cx="5400040" cy="1625600"/>
+            <wp:effectExtent l="0" t="0" r="0" b="0"/>
+            <wp:docPr id="1047162509" name="Imagen 1"/>
+            <wp:cNvGraphicFramePr>
+              <a:graphicFrameLocks xmlns:a="http://schemas.openxmlformats.org/drawingml/2006/main" noChangeAspect="1"/>
+            </wp:cNvGraphicFramePr>
+            <a:graphic xmlns:a="http://schemas.openxmlformats.org/drawingml/2006/main">
+              <a:graphicData uri="http://schemas.openxmlformats.org/drawingml/2006/picture">
+                <pic:pic xmlns:pic="http://schemas.openxmlformats.org/drawingml/2006/picture">
+                  <pic:nvPicPr>
+                    <pic:cNvPr id="1047162509" name=""/>
+                    <pic:cNvPicPr/>
+                  </pic:nvPicPr>
+                  <pic:blipFill>
+                    <a:blip r:embed="rId13"/>
+                    <a:stretch>
+                      <a:fillRect/>
+                    </a:stretch>
+                  </pic:blipFill>
+                  <pic:spPr>
+                    <a:xfrm>
+                      <a:off x="0" y="0"/>
+                      <a:ext cx="5403920" cy="1626768"/>
+                    </a:xfrm>
+                    <a:prstGeom prst="rect">
+                      <a:avLst/>
+                    </a:prstGeom>
+                  </pic:spPr>
+                </pic:pic>
+              </a:graphicData>
+            </a:graphic>
+          </wp:inline>
+        </w:drawing>
       </w:r>
     </w:p>
     <w:sectPr>
@@ -1358,6 +2378,7 @@
   <w:style w:type="character" w:default="1" w:styleId="Fuentedeprrafopredeter">
     <w:name w:val="Default Paragraph Font"/>
     <w:uiPriority w:val="1"/>
+    <w:semiHidden/>
     <w:unhideWhenUsed/>
   </w:style>
   <w:style w:type="table" w:default="1" w:styleId="Tablanormal">
@@ -1670,6 +2691,25 @@
       <w:color w:val="0F4761" w:themeColor="accent1" w:themeShade="BF"/>
       <w:spacing w:val="5"/>
     </w:rPr>
+  </w:style>
+  <w:style w:type="table" w:styleId="Tablaconcuadrcula">
+    <w:name w:val="Table Grid"/>
+    <w:basedOn w:val="Tablanormal"/>
+    <w:uiPriority w:val="39"/>
+    <w:rsid w:val="005A24A8"/>
+    <w:pPr>
+      <w:spacing w:after="0" w:line="240" w:lineRule="auto"/>
+    </w:pPr>
+    <w:tblPr>
+      <w:tblBorders>
+        <w:top w:val="single" w:sz="4" w:space="0" w:color="auto"/>
+        <w:left w:val="single" w:sz="4" w:space="0" w:color="auto"/>
+        <w:bottom w:val="single" w:sz="4" w:space="0" w:color="auto"/>
+        <w:right w:val="single" w:sz="4" w:space="0" w:color="auto"/>
+        <w:insideH w:val="single" w:sz="4" w:space="0" w:color="auto"/>
+        <w:insideV w:val="single" w:sz="4" w:space="0" w:color="auto"/>
+      </w:tblBorders>
+    </w:tblPr>
   </w:style>
 </w:styles>
 </file>

</xml_diff>

<commit_message>
fix: remove local master for serverless
</commit_message>
<xml_diff>
--- a/data.docx
+++ b/data.docx
@@ -68,7 +68,15 @@
         </w:numPr>
       </w:pPr>
       <w:r>
-        <w:t xml:space="preserve">src/ingestion → scripts de ingesta al </w:t>
+        <w:t>src/</w:t>
+      </w:r>
+      <w:proofErr w:type="spellStart"/>
+      <w:r>
+        <w:t>ingestion</w:t>
+      </w:r>
+      <w:proofErr w:type="spellEnd"/>
+      <w:r>
+        <w:t xml:space="preserve"> → scripts de ingesta al </w:t>
       </w:r>
       <w:r>
         <w:rPr>
@@ -87,7 +95,15 @@
         </w:numPr>
       </w:pPr>
       <w:r>
-        <w:t>src/processing → transformaciones</w:t>
+        <w:t>src/</w:t>
+      </w:r>
+      <w:proofErr w:type="spellStart"/>
+      <w:r>
+        <w:t>processing</w:t>
+      </w:r>
+      <w:proofErr w:type="spellEnd"/>
+      <w:r>
+        <w:t xml:space="preserve"> → transformaciones</w:t>
       </w:r>
     </w:p>
     <w:p>
@@ -99,7 +115,15 @@
         </w:numPr>
       </w:pPr>
       <w:r>
-        <w:t>src/utils → funciones reutilizables</w:t>
+        <w:t>src/</w:t>
+      </w:r>
+      <w:proofErr w:type="spellStart"/>
+      <w:r>
+        <w:t>utils</w:t>
+      </w:r>
+      <w:proofErr w:type="spellEnd"/>
+      <w:r>
+        <w:t xml:space="preserve"> → funciones reutilizables</w:t>
       </w:r>
     </w:p>
     <w:p>
@@ -123,7 +147,15 @@
         </w:numPr>
       </w:pPr>
       <w:r>
-        <w:t>logs → para logging del pipeline</w:t>
+        <w:t xml:space="preserve">logs → para </w:t>
+      </w:r>
+      <w:proofErr w:type="spellStart"/>
+      <w:r>
+        <w:t>logging</w:t>
+      </w:r>
+      <w:proofErr w:type="spellEnd"/>
+      <w:r>
+        <w:t xml:space="preserve"> del pipeline</w:t>
       </w:r>
     </w:p>
     <w:p>
@@ -378,7 +410,25 @@
                 <w:sz w:val="18"/>
                 <w:szCs w:val="18"/>
               </w:rPr>
-              <w:t>product_id, nombre producto, tipo_producto, tasa_interes, plazo_meses</w:t>
+              <w:t xml:space="preserve">product_id, nombre producto, tipo_producto, </w:t>
+            </w:r>
+            <w:proofErr w:type="spellStart"/>
+            <w:r>
+              <w:rPr>
+                <w:rFonts w:ascii="Calibri" w:hAnsi="Calibri" w:cs="Calibri"/>
+                <w:sz w:val="18"/>
+                <w:szCs w:val="18"/>
+              </w:rPr>
+              <w:t>tasa_interes</w:t>
+            </w:r>
+            <w:proofErr w:type="spellEnd"/>
+            <w:r>
+              <w:rPr>
+                <w:rFonts w:ascii="Calibri" w:hAnsi="Calibri" w:cs="Calibri"/>
+                <w:sz w:val="18"/>
+                <w:szCs w:val="18"/>
+              </w:rPr>
+              <w:t>, plazo_meses</w:t>
             </w:r>
           </w:p>
         </w:tc>
@@ -948,10 +998,34 @@
     <w:p>
       <w:r>
         <w:lastRenderedPageBreak/>
-        <w:t>CON python -m src.ingestion.upload_bronze VA E</w:t>
-      </w:r>
-      <w:r>
-        <w:t>JECUTAR EL PIPELINE LOCAL Y LO VA CONECTAR A LA BUCKET DE LA CARPETA BRONZE EN FORMATO PARQUET YA QUE EN LOCAL SE TRAAJDO CON CARPETA RAW los csv</w:t>
+        <w:t xml:space="preserve">CON python -m </w:t>
+      </w:r>
+      <w:proofErr w:type="spellStart"/>
+      <w:r>
+        <w:t>src.ingestion.upload_bronze</w:t>
+      </w:r>
+      <w:proofErr w:type="spellEnd"/>
+      <w:r>
+        <w:t xml:space="preserve"> </w:t>
+      </w:r>
+      <w:proofErr w:type="gramStart"/>
+      <w:r>
+        <w:t>VA</w:t>
+      </w:r>
+      <w:proofErr w:type="gramEnd"/>
+      <w:r>
+        <w:t xml:space="preserve"> E</w:t>
+      </w:r>
+      <w:r>
+        <w:t xml:space="preserve">JECUTAR EL PIPELINE LOCAL Y LO </w:t>
+      </w:r>
+      <w:proofErr w:type="gramStart"/>
+      <w:r>
+        <w:t>VA</w:t>
+      </w:r>
+      <w:proofErr w:type="gramEnd"/>
+      <w:r>
+        <w:t xml:space="preserve"> CONECTAR A LA BUCKET DE LA CARPETA BRONZE EN FORMATO PARQUET YA QUE EN LOCAL SE TRAAJDO CON CARPETA RAW los csv</w:t>
       </w:r>
     </w:p>
     <w:p>
@@ -1207,22 +1281,70 @@
       </w:r>
     </w:p>
     <w:p>
-      <w:r>
-        <w:t>PROCESAMIENTO SPARK SERVELES</w:t>
+      <w:pPr>
+        <w:rPr>
+          <w:lang w:val="en-US"/>
+        </w:rPr>
+      </w:pPr>
+      <w:r>
+        <w:rPr>
+          <w:lang w:val="en-US"/>
+        </w:rPr>
+        <w:t xml:space="preserve">Git push </w:t>
+      </w:r>
+      <w:r>
+        <w:rPr>
+          <w:lang w:val="en-US"/>
+        </w:rPr>
+        <w:t>origin feature/001-data-pipleine</w:t>
       </w:r>
     </w:p>
     <w:p>
-      <w:r>
-        <w:t>En local vamos a crear carpeta code donde vamos a tener 2 script</w:t>
-      </w:r>
+      <w:pPr>
+        <w:rPr>
+          <w:lang w:val="en-US"/>
+        </w:rPr>
+      </w:pPr>
+      <w:r>
+        <w:rPr>
+          <w:lang w:val="en-US"/>
+        </w:rPr>
+        <w:t xml:space="preserve">Python -m </w:t>
+      </w:r>
+      <w:proofErr w:type="spellStart"/>
+      <w:r>
+        <w:rPr>
+          <w:lang w:val="en-US"/>
+        </w:rPr>
+        <w:t>src.processiong.silver_to_gold</w:t>
+      </w:r>
+      <w:proofErr w:type="spellEnd"/>
     </w:p>
     <w:p>
+      <w:pPr>
+        <w:rPr>
+          <w:lang w:val="en-US"/>
+        </w:rPr>
+      </w:pPr>
+      <w:r>
+        <w:rPr>
+          <w:lang w:val="en-US"/>
+        </w:rPr>
+        <w:t>PROCESAMIENTO SPARK SERVELES</w:t>
+      </w:r>
+    </w:p>
+    <w:p>
+      <w:r>
+        <w:t>En local vamos a crear carpeta code donde vamos a tener 2 script</w:t>
+      </w:r>
+    </w:p>
+    <w:p>
       <w:r>
         <w:drawing>
-          <wp:inline distT="0" distB="0" distL="0" distR="0" wp14:anchorId="14135311" wp14:editId="39C5E1D1">
-            <wp:extent cx="4547900" cy="1960033"/>
-            <wp:effectExtent l="0" t="0" r="5080" b="2540"/>
-            <wp:docPr id="144892331" name="Imagen 1"/>
+          <wp:inline distT="0" distB="0" distL="0" distR="0" wp14:anchorId="6A29685B" wp14:editId="08577DBA">
+            <wp:extent cx="5400040" cy="1756833"/>
+            <wp:effectExtent l="0" t="0" r="0" b="0"/>
+            <wp:docPr id="2101773435" name="Imagen 1"/>
             <wp:cNvGraphicFramePr>
               <a:graphicFrameLocks xmlns:a="http://schemas.openxmlformats.org/drawingml/2006/main" noChangeAspect="1"/>
             </wp:cNvGraphicFramePr>
@@ -1230,7 +1352,7 @@
               <a:graphicData uri="http://schemas.openxmlformats.org/drawingml/2006/picture">
                 <pic:pic xmlns:pic="http://schemas.openxmlformats.org/drawingml/2006/picture">
                   <pic:nvPicPr>
-                    <pic:cNvPr id="144892331" name=""/>
+                    <pic:cNvPr id="2101773435" name=""/>
                     <pic:cNvPicPr/>
                   </pic:nvPicPr>
                   <pic:blipFill>
@@ -1242,7 +1364,7 @@
                   <pic:spPr>
                     <a:xfrm>
                       <a:off x="0" y="0"/>
-                      <a:ext cx="4570795" cy="1969900"/>
+                      <a:ext cx="5407825" cy="1759366"/>
                     </a:xfrm>
                     <a:prstGeom prst="rect">
                       <a:avLst/>
@@ -1299,6 +1421,178 @@
         </w:drawing>
       </w:r>
     </w:p>
+    <w:p>
+      <w:r>
+        <w:t>Ahora tener instalado Java</w:t>
+      </w:r>
+    </w:p>
+    <w:p>
+      <w:r>
+        <w:lastRenderedPageBreak/>
+        <w:drawing>
+          <wp:inline distT="0" distB="0" distL="0" distR="0" wp14:anchorId="795DA309" wp14:editId="38EFD7CF">
+            <wp:extent cx="5400040" cy="907415"/>
+            <wp:effectExtent l="0" t="0" r="0" b="6985"/>
+            <wp:docPr id="622242691" name="Imagen 1"/>
+            <wp:cNvGraphicFramePr>
+              <a:graphicFrameLocks xmlns:a="http://schemas.openxmlformats.org/drawingml/2006/main" noChangeAspect="1"/>
+            </wp:cNvGraphicFramePr>
+            <a:graphic xmlns:a="http://schemas.openxmlformats.org/drawingml/2006/main">
+              <a:graphicData uri="http://schemas.openxmlformats.org/drawingml/2006/picture">
+                <pic:pic xmlns:pic="http://schemas.openxmlformats.org/drawingml/2006/picture">
+                  <pic:nvPicPr>
+                    <pic:cNvPr id="622242691" name=""/>
+                    <pic:cNvPicPr/>
+                  </pic:nvPicPr>
+                  <pic:blipFill>
+                    <a:blip r:embed="rId14"/>
+                    <a:stretch>
+                      <a:fillRect/>
+                    </a:stretch>
+                  </pic:blipFill>
+                  <pic:spPr>
+                    <a:xfrm>
+                      <a:off x="0" y="0"/>
+                      <a:ext cx="5400040" cy="907415"/>
+                    </a:xfrm>
+                    <a:prstGeom prst="rect">
+                      <a:avLst/>
+                    </a:prstGeom>
+                  </pic:spPr>
+                </pic:pic>
+              </a:graphicData>
+            </a:graphic>
+          </wp:inline>
+        </w:drawing>
+      </w:r>
+    </w:p>
+    <w:p>
+      <w:r>
+        <w:drawing>
+          <wp:inline distT="0" distB="0" distL="0" distR="0" wp14:anchorId="704FC638" wp14:editId="2834F0C0">
+            <wp:extent cx="5400040" cy="2849033"/>
+            <wp:effectExtent l="0" t="0" r="0" b="8890"/>
+            <wp:docPr id="966314534" name="Imagen 1"/>
+            <wp:cNvGraphicFramePr>
+              <a:graphicFrameLocks xmlns:a="http://schemas.openxmlformats.org/drawingml/2006/main" noChangeAspect="1"/>
+            </wp:cNvGraphicFramePr>
+            <a:graphic xmlns:a="http://schemas.openxmlformats.org/drawingml/2006/main">
+              <a:graphicData uri="http://schemas.openxmlformats.org/drawingml/2006/picture">
+                <pic:pic xmlns:pic="http://schemas.openxmlformats.org/drawingml/2006/picture">
+                  <pic:nvPicPr>
+                    <pic:cNvPr id="966314534" name=""/>
+                    <pic:cNvPicPr/>
+                  </pic:nvPicPr>
+                  <pic:blipFill>
+                    <a:blip r:embed="rId15"/>
+                    <a:stretch>
+                      <a:fillRect/>
+                    </a:stretch>
+                  </pic:blipFill>
+                  <pic:spPr>
+                    <a:xfrm>
+                      <a:off x="0" y="0"/>
+                      <a:ext cx="5400842" cy="2849456"/>
+                    </a:xfrm>
+                    <a:prstGeom prst="rect">
+                      <a:avLst/>
+                    </a:prstGeom>
+                  </pic:spPr>
+                </pic:pic>
+              </a:graphicData>
+            </a:graphic>
+          </wp:inline>
+        </w:drawing>
+      </w:r>
+    </w:p>
+    <w:p>
+      <w:r>
+        <w:drawing>
+          <wp:inline distT="0" distB="0" distL="0" distR="0" wp14:anchorId="007D4371" wp14:editId="43E82A2F">
+            <wp:extent cx="5400040" cy="2239645"/>
+            <wp:effectExtent l="0" t="0" r="0" b="8255"/>
+            <wp:docPr id="41780575" name="Imagen 1"/>
+            <wp:cNvGraphicFramePr>
+              <a:graphicFrameLocks xmlns:a="http://schemas.openxmlformats.org/drawingml/2006/main" noChangeAspect="1"/>
+            </wp:cNvGraphicFramePr>
+            <a:graphic xmlns:a="http://schemas.openxmlformats.org/drawingml/2006/main">
+              <a:graphicData uri="http://schemas.openxmlformats.org/drawingml/2006/picture">
+                <pic:pic xmlns:pic="http://schemas.openxmlformats.org/drawingml/2006/picture">
+                  <pic:nvPicPr>
+                    <pic:cNvPr id="41780575" name=""/>
+                    <pic:cNvPicPr/>
+                  </pic:nvPicPr>
+                  <pic:blipFill>
+                    <a:blip r:embed="rId16"/>
+                    <a:stretch>
+                      <a:fillRect/>
+                    </a:stretch>
+                  </pic:blipFill>
+                  <pic:spPr>
+                    <a:xfrm>
+                      <a:off x="0" y="0"/>
+                      <a:ext cx="5400040" cy="2239645"/>
+                    </a:xfrm>
+                    <a:prstGeom prst="rect">
+                      <a:avLst/>
+                    </a:prstGeom>
+                  </pic:spPr>
+                </pic:pic>
+              </a:graphicData>
+            </a:graphic>
+          </wp:inline>
+        </w:drawing>
+      </w:r>
+    </w:p>
+    <w:p>
+      <w:r>
+        <w:t xml:space="preserve">Con eso logramos: </w:t>
+      </w:r>
+    </w:p>
+    <w:p>
+      <w:r>
+        <w:rPr>
+          <w:rFonts w:ascii="Segoe UI Symbol" w:hAnsi="Segoe UI Symbol" w:cs="Segoe UI Symbol"/>
+        </w:rPr>
+        <w:t>✔</w:t>
+      </w:r>
+      <w:r>
+        <w:t xml:space="preserve"> PySpark correcto</w:t>
+      </w:r>
+      <w:r>
+        <w:br/>
+      </w:r>
+      <w:r>
+        <w:rPr>
+          <w:rFonts w:ascii="Segoe UI Symbol" w:hAnsi="Segoe UI Symbol" w:cs="Segoe UI Symbol"/>
+        </w:rPr>
+        <w:t>✔</w:t>
+      </w:r>
+      <w:r>
+        <w:t xml:space="preserve"> </w:t>
+      </w:r>
+      <w:proofErr w:type="spellStart"/>
+      <w:r>
+        <w:t>SparkSession</w:t>
+      </w:r>
+      <w:proofErr w:type="spellEnd"/>
+      <w:r>
+        <w:t xml:space="preserve"> creada</w:t>
+      </w:r>
+      <w:r>
+        <w:br/>
+      </w:r>
+      <w:r>
+        <w:rPr>
+          <w:rFonts w:ascii="Segoe UI Symbol" w:hAnsi="Segoe UI Symbol" w:cs="Segoe UI Symbol"/>
+        </w:rPr>
+        <w:t>✔</w:t>
+      </w:r>
+      <w:r>
+        <w:t xml:space="preserve"> Entorno listo</w:t>
+      </w:r>
+    </w:p>
+    <w:p/>
     <w:sectPr>
       <w:pgSz w:w="11906" w:h="16838"/>
       <w:pgMar w:top="1417" w:right="1701" w:bottom="1417" w:left="1701" w:header="708" w:footer="708" w:gutter="0"/>
@@ -2378,7 +2672,6 @@
   <w:style w:type="character" w:default="1" w:styleId="Fuentedeprrafopredeter">
     <w:name w:val="Default Paragraph Font"/>
     <w:uiPriority w:val="1"/>
-    <w:semiHidden/>
     <w:unhideWhenUsed/>
   </w:style>
   <w:style w:type="table" w:default="1" w:styleId="Tablanormal">

</xml_diff>